<commit_message>
Dust & Damnation: Talisman Edge in the American folk traditions
- Talisman (1 Edge): a ready charm made in the old folk ways (a hoodoo
  mojo hand, a Voodoo gris-gris, a Pennsylvania Dutch hex letter, an
  Appalachian granny woman's buckeye) holding a Minor ritual agreed with
  the GM; break it to release it; renewed between jobs; outside the charm
  limit. The creator asks who made it and what it does.
- Guide: a Folk talismans line under Magic.

Co-Authored-By: Claude Opus 5.5 <noreply@anthropic.com>
Claude-Session: https://claude.ai/code/session_015SADCFzhKijkC2foUmXrpC
</commit_message>
<xml_diff>
--- a/legend-dynamics/site/dust-and-damnation/Dust_Damnation_Players_Guide.docx
+++ b/legend-dynamics/site/dust-and-damnation/Dust_Damnation_Players_Guide.docx
@@ -3088,6 +3088,54 @@
                 <w:sz w:val="19"/>
               </w:rPr>
               <w:t xml:space="preserve">An heirloom weapon, a master’s instruments or a fine kit: +2 to one named skill when it’s used</w:t>
+            </w:r>
+          </w:p>
+        </w:tc>
+        <w:tc>
+          <w:tcPr/>
+          <w:p>
+            <w:pPr>
+              <w:pStyle w:val="Compact"/>
+              <w:jc w:val="left"/>
+            </w:pPr>
+            <w:r>
+              <w:rPr>
+                <w:sz w:val="19"/>
+              </w:rPr>
+              <w:t xml:space="preserve">1</w:t>
+            </w:r>
+          </w:p>
+        </w:tc>
+      </w:tr>
+      <w:tr>
+        <w:tc>
+          <w:tcPr/>
+          <w:p>
+            <w:pPr>
+              <w:pStyle w:val="Compact"/>
+              <w:jc w:val="left"/>
+            </w:pPr>
+            <w:r>
+              <w:rPr>
+                <w:b/>
+                <w:sz w:val="19"/>
+              </w:rPr>
+              <w:t xml:space="preserve">Talisman</w:t>
+            </w:r>
+          </w:p>
+        </w:tc>
+        <w:tc>
+          <w:tcPr/>
+          <w:p>
+            <w:pPr>
+              <w:pStyle w:val="Compact"/>
+              <w:jc w:val="left"/>
+            </w:pPr>
+            <w:r>
+              <w:rPr>
+                <w:sz w:val="19"/>
+              </w:rPr>
+              <w:t xml:space="preserve">A ready charm from the folk traditions: a hoodoo mojo hand, a gris-gris, a hex letter sewn in your coat, a buckeye blessed by a granny woman. It holds a Minor ritual agreed with the GM; break it to release it. Anyone can carry one. It’s renewed between jobs and doesn’t count against a charm limit.</w:t>
             </w:r>
           </w:p>
         </w:tc>
@@ -14280,6 +14328,44 @@
       </w:r>
       <w:r>
         <w:t xml:space="preserve">Carry as many ready charms as your Occult training allows: Trained 2, Specialty 3, Expert 4. A Sorcerer carries only one.</w:t>
+      </w:r>
+    </w:p>
+    <w:p>
+      <w:pPr>
+        <w:numPr>
+          <w:ilvl w:val="0"/>
+          <w:numId w:val="1012"/>
+        </w:numPr>
+        <w:pStyle w:val="Compact"/>
+      </w:pPr>
+      <w:r>
+        <w:rPr>
+          <w:bCs/>
+          <w:b/>
+        </w:rPr>
+        <w:t xml:space="preserve">Folk talismans.</w:t>
+      </w:r>
+      <w:r>
+        <w:t xml:space="preserve"> </w:t>
+      </w:r>
+      <w:r>
+        <w:t xml:space="preserve">Anyone, practitioner or not, can carry a charm made in the old folk ways through the</w:t>
+      </w:r>
+      <w:r>
+        <w:t xml:space="preserve"> </w:t>
+      </w:r>
+      <w:r>
+        <w:rPr>
+          <w:bCs/>
+          <w:b/>
+        </w:rPr>
+        <w:t xml:space="preserve">Talisman</w:t>
+      </w:r>
+      <w:r>
+        <w:t xml:space="preserve"> </w:t>
+      </w:r>
+      <w:r>
+        <w:t xml:space="preserve">Edge: a mojo hand from a hoodoo root doctor, a gris-gris from a Voodoo mambo in New Orleans, a hex letter from a Pennsylvania Dutch powwow doctor, a blessed buckeye from an Appalachian granny woman. It holds a Minor ritual, is renewed between jobs, and doesn’t count against a charm limit.</w:t>
       </w:r>
     </w:p>
     <w:p>

</xml_diff>

<commit_message>
Dust & Damnation: German magical traditions
- Braucher, a new Practitioner tradition: Pennsylvania German powwow,
  healing and warding by whispered charms; a minute a roll for a charm
  over a wound; +2 to Occult to heal and to ward. Companion complication
  Never for Pay.
- Hermeticists' grimoires now include the Sixth and Seventh Books of Moses.
- Talisman Edge: a Himmelsbrief (heaven's letter) among its examples.
- Guide: "The old country's magic" paragraph under Magic (Braucher,
  heaven's letters, the Books of Moses, the Hexenmeister).

Co-Authored-By: Claude Opus 5.5 <noreply@anthropic.com>
Claude-Session: https://claude.ai/code/session_015SADCFzhKijkC2foUmXrpC
</commit_message>
<xml_diff>
--- a/legend-dynamics/site/dust-and-damnation/Dust_Damnation_Players_Guide.docx
+++ b/legend-dynamics/site/dust-and-damnation/Dust_Damnation_Players_Guide.docx
@@ -3135,7 +3135,7 @@
               <w:rPr>
                 <w:sz w:val="19"/>
               </w:rPr>
-              <w:t xml:space="preserve">A ready charm from the folk traditions: a hoodoo mojo hand, a gris-gris, a hex letter sewn in your coat, a buckeye blessed by a granny woman. It holds a Minor ritual agreed with the GM; break it to release it. Anyone can carry one. It’s renewed between jobs and doesn’t count against a charm limit.</w:t>
+              <w:t xml:space="preserve">A ready charm from the folk traditions: a hoodoo mojo hand, a gris-gris, a Himmelsbrief (a German heaven’s letter) sewn in your coat, a buckeye blessed by a granny woman. It holds a Minor ritual agreed with the GM; break it to release it. Anyone can carry one. It’s renewed between jobs and doesn’t count against a charm limit.</w:t>
             </w:r>
           </w:p>
         </w:tc>
@@ -10923,7 +10923,7 @@
               <w:rPr>
                 <w:sz w:val="19"/>
               </w:rPr>
-              <w:t xml:space="preserve">Every Practitioner, at their tradition’s pace: ten minutes a roll; an hour for a Hermeticist.</w:t>
+              <w:t xml:space="preserve">Every Practitioner, at their tradition’s pace: ten minutes a roll; an hour for a Hermeticist; a minute for a Braucher’s healing charm.</w:t>
             </w:r>
           </w:p>
         </w:tc>
@@ -14043,7 +14043,7 @@
         <w:t xml:space="preserve"> </w:t>
       </w:r>
       <w:r>
-        <w:t xml:space="preserve">rolls at your tradition’s pace, usually ten minutes a roll, an hour for a Hermeticist. Most western magic is slow, so practitioners prepare: a finished ritual stored as a</w:t>
+        <w:t xml:space="preserve">rolls at your tradition’s pace, usually ten minutes a roll, an hour for a Hermeticist, a minute for a Braucher’s healing charm. Most western magic is slow, so practitioners prepare: a finished ritual stored as a</w:t>
       </w:r>
       <w:r>
         <w:t xml:space="preserve"> </w:t>
@@ -14365,7 +14365,7 @@
         <w:t xml:space="preserve"> </w:t>
       </w:r>
       <w:r>
-        <w:t xml:space="preserve">Edge: a mojo hand from a hoodoo root doctor, a gris-gris from a Voodoo mambo in New Orleans, a hex letter from a Pennsylvania Dutch powwow doctor, a blessed buckeye from an Appalachian granny woman. It holds a Minor ritual, is renewed between jobs, and doesn’t count against a charm limit.</w:t>
+        <w:t xml:space="preserve">Edge: a mojo hand from a hoodoo root doctor, a gris-gris from a Voodoo mambo in New Orleans, a Himmelsbrief (heaven’s letter) from a Pennsylvania German powwow doctor, a blessed buckeye from an Appalachian granny woman. It holds a Minor ritual, is renewed between jobs, and doesn’t count against a charm limit.</w:t>
       </w:r>
     </w:p>
     <w:p>
@@ -14401,6 +14401,98 @@
       </w:r>
       <w:r>
         <w:t xml:space="preserve">, and the Order of the Iron Cross hunts known practitioners.</w:t>
+      </w:r>
+    </w:p>
+    <w:p>
+      <w:pPr>
+        <w:pStyle w:val="FirstParagraph"/>
+      </w:pPr>
+      <w:r>
+        <w:rPr>
+          <w:bCs/>
+          <w:b/>
+        </w:rPr>
+        <w:t xml:space="preserve">The old country’s magic.</w:t>
+      </w:r>
+      <w:r>
+        <w:t xml:space="preserve"> </w:t>
+      </w:r>
+      <w:r>
+        <w:t xml:space="preserve">German settlers brought theirs west with the wagons.</w:t>
+      </w:r>
+      <w:r>
+        <w:t xml:space="preserve"> </w:t>
+      </w:r>
+      <w:r>
+        <w:rPr>
+          <w:bCs/>
+          <w:b/>
+        </w:rPr>
+        <w:t xml:space="preserve">Braucher</w:t>
+      </w:r>
+      <w:r>
+        <w:t xml:space="preserve">, the powwow doctors of the Pennsylvania settlements, the Ohio valley and the Texas Hill Country, heal with charms whispered from Hohman’s</w:t>
+      </w:r>
+      <w:r>
+        <w:t xml:space="preserve"> </w:t>
+      </w:r>
+      <w:r>
+        <w:rPr>
+          <w:iCs/>
+          <w:i/>
+        </w:rPr>
+        <w:t xml:space="preserve">Long Lost Friend</w:t>
+      </w:r>
+      <w:r>
+        <w:t xml:space="preserve"> </w:t>
+      </w:r>
+      <w:r>
+        <w:t xml:space="preserve">and never take pay. Soldiers sew</w:t>
+      </w:r>
+      <w:r>
+        <w:t xml:space="preserve"> </w:t>
+      </w:r>
+      <w:r>
+        <w:rPr>
+          <w:bCs/>
+          <w:b/>
+        </w:rPr>
+        <w:t xml:space="preserve">heaven’s letters</w:t>
+      </w:r>
+      <w:r>
+        <w:t xml:space="preserve"> </w:t>
+      </w:r>
+      <w:r>
+        <w:t xml:space="preserve">into their coats against bullets. The</w:t>
+      </w:r>
+      <w:r>
+        <w:t xml:space="preserve"> </w:t>
+      </w:r>
+      <w:r>
+        <w:rPr>
+          <w:iCs/>
+          <w:i/>
+        </w:rPr>
+        <w:t xml:space="preserve">Sixth and Seventh Books of Moses</w:t>
+      </w:r>
+      <w:r>
+        <w:t xml:space="preserve">, a German grimoire, passes from hand to hand, prized by Hermeticists and hoodoo root doctors alike. And where there is a Braucher, there is a</w:t>
+      </w:r>
+      <w:r>
+        <w:t xml:space="preserve"> </w:t>
+      </w:r>
+      <w:r>
+        <w:rPr>
+          <w:bCs/>
+          <w:b/>
+        </w:rPr>
+        <w:t xml:space="preserve">Hexenmeister</w:t>
+      </w:r>
+      <w:r>
+        <w:t xml:space="preserve"> </w:t>
+      </w:r>
+      <w:r>
+        <w:t xml:space="preserve">who will curse for money.</w:t>
       </w:r>
     </w:p>
     <w:bookmarkStart w:id="78" w:name="hexes-1"/>
@@ -22051,7 +22143,7 @@
         <w:pStyle w:val="BodyText"/>
       </w:pPr>
       <w:r>
-        <w:t xml:space="preserve">A human who works real magic in a tradition: alchemy, witchcraft, the old hermetic arts or worse. Preachers call it devilry, and monster hunters keep a list.</w:t>
+        <w:t xml:space="preserve">A human who works real magic in a tradition: alchemy, witchcraft, Pennsylvania German powwow, the old hermetic arts or worse. Preachers call it devilry, and monster hunters keep a list.</w:t>
       </w:r>
     </w:p>
     <w:p>
@@ -22289,7 +22381,7 @@
               <w:rPr>
                 <w:sz w:val="19"/>
               </w:rPr>
-              <w:t xml:space="preserve">Ritual magic from grimoires, circles and sigils: wards, bindings, divination. An hour per roll, and it needs books. +2 to Occult for wards and bindings.</w:t>
+              <w:t xml:space="preserve">Ritual magic from grimoires, circles and sigils (the Key of Solomon, the German Sixth and Seventh Books of Moses): wards, bindings, divination. An hour per roll, and it needs books. +2 to Occult for wards and bindings.</w:t>
             </w:r>
           </w:p>
         </w:tc>
@@ -22443,6 +22535,68 @@
                 <w:sz w:val="19"/>
               </w:rPr>
               <w:t xml:space="preserve">Your charms demand their rituals. Accept the delay or the odd behavior they require.</w:t>
+            </w:r>
+          </w:p>
+        </w:tc>
+      </w:tr>
+      <w:tr>
+        <w:tc>
+          <w:tcPr/>
+          <w:p>
+            <w:pPr>
+              <w:pStyle w:val="Compact"/>
+              <w:jc w:val="left"/>
+            </w:pPr>
+            <w:r>
+              <w:rPr>
+                <w:b/>
+                <w:sz w:val="19"/>
+              </w:rPr>
+              <w:t xml:space="preserve">Braucher</w:t>
+            </w:r>
+          </w:p>
+        </w:tc>
+        <w:tc>
+          <w:tcPr/>
+          <w:p>
+            <w:pPr>
+              <w:pStyle w:val="Compact"/>
+              <w:jc w:val="left"/>
+            </w:pPr>
+            <w:r>
+              <w:rPr>
+                <w:sz w:val="19"/>
+              </w:rPr>
+              <w:t xml:space="preserve">Pennsylvania German powwow (Brauche): healing and protection by whispered charms, the sign of the cross and Hohman’s Long Lost Friend. A minute a roll, not ten, for a charm spoken over a wound, a burn or a sick child. +2 to Occult to heal, and to ward a person, house or barn against fire, theft, bullets and hexes.</w:t>
+            </w:r>
+          </w:p>
+        </w:tc>
+        <w:tc>
+          <w:tcPr/>
+          <w:p>
+            <w:pPr>
+              <w:pStyle w:val="Compact"/>
+              <w:jc w:val="left"/>
+            </w:pPr>
+            <w:r>
+              <w:rPr>
+                <w:bCs/>
+                <w:b/>
+                <w:sz w:val="19"/>
+              </w:rPr>
+              <w:t xml:space="preserve">Never for Pay.</w:t>
+            </w:r>
+            <w:r>
+              <w:rPr>
+                <w:sz w:val="19"/>
+              </w:rPr>
+              <w:t xml:space="preserve"> </w:t>
+            </w:r>
+            <w:r>
+              <w:rPr>
+                <w:sz w:val="19"/>
+              </w:rPr>
+              <w:t xml:space="preserve">The gift fails if you ask for money, and the old rule says to teach it only to someone of the other sex. Accept the gift you can’t refuse or the debt you can’t collect.</w:t>
             </w:r>
           </w:p>
         </w:tc>

</xml_diff>

<commit_message>
Dust & Damnation: Block, with a shield or whatever comes to hand
- Block (published from the lab): against a blade, club, claws, fists or an
  arrow, Melee -2 instead of Dodge, once a round; never a bullet.
- Shield (gear): a hide shield or an iron-bound buckler, +1 to Block.
- Improvised shield: a chair, a wooden slat, a crate lid or a saddle, no
  bonus; it breaks the first time it blocks a hit of 2+ boxes.
- Creator: the roller offers Block with each shield the character has, and
  always an improvised one. Quick reference updated.

Co-Authored-By: Claude Opus 5.5 <noreply@anthropic.com>
Claude-Session: https://claude.ai/code/session_015SADCFzhKijkC2foUmXrpC
</commit_message>
<xml_diff>
--- a/legend-dynamics/site/dust-and-damnation/Dust_Damnation_Players_Guide.docx
+++ b/legend-dynamics/site/dust-and-damnation/Dust_Damnation_Players_Guide.docx
@@ -6028,6 +6028,39 @@
                 <w:b/>
                 <w:sz w:val="19"/>
               </w:rPr>
+              <w:t xml:space="preserve">Shield</w:t>
+            </w:r>
+          </w:p>
+        </w:tc>
+        <w:tc>
+          <w:tcPr/>
+          <w:p>
+            <w:pPr>
+              <w:pStyle w:val="Compact"/>
+              <w:jc w:val="left"/>
+            </w:pPr>
+            <w:r>
+              <w:rPr>
+                <w:sz w:val="19"/>
+              </w:rPr>
+              <w:t xml:space="preserve">A hide shield or an iron-bound buckler, rare out West: you Block at +1.</w:t>
+            </w:r>
+          </w:p>
+        </w:tc>
+      </w:tr>
+      <w:tr>
+        <w:tc>
+          <w:tcPr/>
+          <w:p>
+            <w:pPr>
+              <w:pStyle w:val="Compact"/>
+              <w:jc w:val="left"/>
+            </w:pPr>
+            <w:r>
+              <w:rPr>
+                <w:b/>
+                <w:sz w:val="19"/>
+              </w:rPr>
               <w:t xml:space="preserve">Lantern and matches</w:t>
             </w:r>
           </w:p>
@@ -6950,6 +6983,28 @@
       </w:r>
       <w:r>
         <w:t xml:space="preserve">Against a blade, a club, claws or fists, you can parry instead of Dodge: roll Melee −3 with a weapon in hand, or Brawling −3 bare-handed against fists, claws and fangs. Each parry after your first in a round is a further −2. Nobody parries a bullet or an arrow.</w:t>
+      </w:r>
+    </w:p>
+    <w:p>
+      <w:pPr>
+        <w:numPr>
+          <w:ilvl w:val="0"/>
+          <w:numId w:val="1008"/>
+        </w:numPr>
+        <w:pStyle w:val="Compact"/>
+      </w:pPr>
+      <w:r>
+        <w:rPr>
+          <w:bCs/>
+          <w:b/>
+        </w:rPr>
+        <w:t xml:space="preserve">Block.</w:t>
+      </w:r>
+      <w:r>
+        <w:t xml:space="preserve"> </w:t>
+      </w:r>
+      <w:r>
+        <w:t xml:space="preserve">With a shield, or anything that can stand in for one (a chair, a wooden slat, a crate lid, a saddle), you can block a blade, a club, claws, fists or an arrow instead of Dodge: roll Melee −2, or Melee −1 with a real shield. Once a round. Nothing you can lift blocks a bullet. An improvised shield breaks the first time it blocks a hit of 2 or more boxes.</w:t>
       </w:r>
     </w:p>
     <w:p>

</xml_diff>

<commit_message>
Dust & Damnation: one defense a round; Additional Defense Edge
- Replaces "defend against every attack": Dodge, Parry and Block are all
  defenses, and a character gets one a round.
- Additional Defense (1 Edge): a second defense each round, in any mix; a
  second parry is still -2.
- Creator: the sheet says how many defenses a round; the roller's "parries
  already this round" appears only with the Edge. Guide example and quick
  reference updated.

Co-Authored-By: Claude Opus 5.5 <noreply@anthropic.com>
Claude-Session: https://claude.ai/code/session_015SADCFzhKijkC2foUmXrpC
</commit_message>
<xml_diff>
--- a/legend-dynamics/site/dust-and-damnation/Dust_Damnation_Players_Guide.docx
+++ b/legend-dynamics/site/dust-and-damnation/Dust_Damnation_Players_Guide.docx
@@ -3155,6 +3155,54 @@
           </w:p>
         </w:tc>
       </w:tr>
+      <w:tr>
+        <w:tc>
+          <w:tcPr/>
+          <w:p>
+            <w:pPr>
+              <w:pStyle w:val="Compact"/>
+              <w:jc w:val="left"/>
+            </w:pPr>
+            <w:r>
+              <w:rPr>
+                <w:b/>
+                <w:sz w:val="19"/>
+              </w:rPr>
+              <w:t xml:space="preserve">Additional Defense</w:t>
+            </w:r>
+          </w:p>
+        </w:tc>
+        <w:tc>
+          <w:tcPr/>
+          <w:p>
+            <w:pPr>
+              <w:pStyle w:val="Compact"/>
+              <w:jc w:val="left"/>
+            </w:pPr>
+            <w:r>
+              <w:rPr>
+                <w:sz w:val="19"/>
+              </w:rPr>
+              <w:t xml:space="preserve">Defend twice a round instead of once: Dodge, Parry or Block, in any mix. A second parry is still −2.</w:t>
+            </w:r>
+          </w:p>
+        </w:tc>
+        <w:tc>
+          <w:tcPr/>
+          <w:p>
+            <w:pPr>
+              <w:pStyle w:val="Compact"/>
+              <w:jc w:val="left"/>
+            </w:pPr>
+            <w:r>
+              <w:rPr>
+                <w:sz w:val="19"/>
+              </w:rPr>
+              <w:t xml:space="preserve">1</w:t>
+            </w:r>
+          </w:p>
+        </w:tc>
+      </w:tr>
     </w:tbl>
     <w:bookmarkEnd w:id="26"/>
     <w:bookmarkStart w:id="27" w:name="spending-points"/>
@@ -6932,13 +6980,29 @@
           <w:bCs/>
           <w:b/>
         </w:rPr>
-        <w:t xml:space="preserve">Defend against every attack.</w:t>
-      </w:r>
-      <w:r>
-        <w:t xml:space="preserve"> </w:t>
-      </w:r>
-      <w:r>
-        <w:t xml:space="preserve">A target may defend against every attack, not just one a round.</w:t>
+        <w:t xml:space="preserve">One defense a round.</w:t>
+      </w:r>
+      <w:r>
+        <w:t xml:space="preserve"> </w:t>
+      </w:r>
+      <w:r>
+        <w:t xml:space="preserve">Dodge, Parry and Block are all defenses, and you get one a round, between your turns: choose which when an attack hits. The</w:t>
+      </w:r>
+      <w:r>
+        <w:t xml:space="preserve"> </w:t>
+      </w:r>
+      <w:r>
+        <w:rPr>
+          <w:bCs/>
+          <w:b/>
+        </w:rPr>
+        <w:t xml:space="preserve">Additional Defense</w:t>
+      </w:r>
+      <w:r>
+        <w:t xml:space="preserve"> </w:t>
+      </w:r>
+      <w:r>
+        <w:t xml:space="preserve">Edge gives you a second.</w:t>
       </w:r>
     </w:p>
     <w:p>
@@ -6982,7 +7046,7 @@
         <w:t xml:space="preserve"> </w:t>
       </w:r>
       <w:r>
-        <w:t xml:space="preserve">Against a blade, a club, claws or fists, you can parry instead of Dodge: roll Melee −3 with a weapon in hand, or Brawling −3 bare-handed against fists, claws and fangs. Each parry after your first in a round is a further −2. Nobody parries a bullet or an arrow.</w:t>
+        <w:t xml:space="preserve">Against a blade, a club, claws or fists, you can parry instead of Dodge: roll Melee −3 with a weapon in hand, or Brawling −3 bare-handed against fists, claws and fangs. A second parry in the same round (with Additional Defense) is a further −2. Nobody parries a bullet or an arrow.</w:t>
       </w:r>
     </w:p>
     <w:p>
@@ -7004,7 +7068,7 @@
         <w:t xml:space="preserve"> </w:t>
       </w:r>
       <w:r>
-        <w:t xml:space="preserve">With a shield, or anything that can stand in for one (a chair, a wooden slat, a crate lid, a saddle), you can block a blade, a club, claws, fists or an arrow instead of Dodge: roll Melee −2, or Melee −1 with a real shield. Once a round. Nothing you can lift blocks a bullet. An improvised shield breaks the first time it blocks a hit of 2 or more boxes.</w:t>
+        <w:t xml:space="preserve">With a shield, or anything that can stand in for one (a chair, a wooden slat, a crate lid, a saddle), you can block a blade, a club, claws, fists or an arrow instead of Dodge: roll Melee −2, or Melee −1 with a real shield. Nothing you can lift blocks a bullet. An improvised shield breaks the first time it blocks a hit of 2 or more boxes.</w:t>
       </w:r>
     </w:p>
     <w:p>
@@ -7079,7 +7143,7 @@
         <w:t xml:space="preserve"> </w:t>
       </w:r>
       <w:r>
-        <w:t xml:space="preserve">a werewolf’s claws succeed by 5 against Deputy Ames. Ames already dodged a knife this round, but may still defend: Dodge 11, −2 for the clean hit, needs a 9 or less. A parry with the saber would be Melee 14 −3 −2 = 9, no better, so Ames dodges.</w:t>
+        <w:t xml:space="preserve">a werewolf’s claws succeed by 5 against Deputy Ames, who hasn’t defended yet this round. Dodge is 11, −2 for the clean hit: Ames needs a 9 or less. A parry with the saber would be Melee 14 −3 −2 = 9, no better, so Ames dodges. When the second wolf lunges before Ames’s next turn, there’s no defense left, unless Ames has Additional Defense.</w:t>
       </w:r>
     </w:p>
     <w:bookmarkEnd w:id="51"/>

</xml_diff>